<commit_message>
Draw payback and decision-grade conclusions in launch report
The report established that launches were incremental but stopped short of
saying whether they were worth doing. Adds a payback section measuring what
launch-acquired customers went on to spend against period-matched CAC, and
replaces the advisory closing section with stated conclusions.

Observation windows are equalised for the payback comparison; without that
the most recent launch looks materially worse purely from truncation.

Co-Authored-By: Claude Opus 5 <noreply@anthropic.com>
Claude-Session: https://claude.ai/code/session_01JK5AXzGYuWMe65NkGxqHiE
</commit_message>
<xml_diff>
--- a/analysis/TrueSeaMoss_Flavour_Launch_Analysis.docx
+++ b/analysis/TrueSeaMoss_Flavour_Launch_Analysis.docx
@@ -179,13 +179,25 @@
       <w:r>
         <w:rPr>
           <w:rFonts w:ascii="Calibri" w:cs="Calibri" w:eastAsia="Calibri" w:hAnsi="Calibri"/>
-          <w:b w:val="false"/>
-          <w:bCs w:val="false"/>
           <w:color w:val="1B2A27"/>
           <w:sz w:val="21"/>
           <w:szCs w:val="21"/>
         </w:rPr>
-        <w:t xml:space="preserve">The practical implication is that launches should be budgeted and judged as customer-acquisition campaigns, measured on new-to-brand volume, acquisition cost and repeat rate, rather than as portfolio decisions about which flavour takes share from which.</w:t>
+        <w:t xml:space="preserve">Every launch paid back on a revenue basis inside 60 days, returning 1.55 to 1.91 times the blended cost of acquisition prevailing in its own launch month. Against the stricter cost per new paid customer, the margin is thinner, at 1.11 to 1.39 times.</w:t>
+      </w:r>
+    </w:p>
+    <w:p>
+      <w:pPr>
+        <w:spacing w:after="160" w:line="276"/>
+      </w:pPr>
+      <w:r>
+        <w:rPr>
+          <w:rFonts w:ascii="Calibri" w:cs="Calibri" w:eastAsia="Calibri" w:hAnsi="Calibri"/>
+          <w:color w:val="1B2A27"/>
+          <w:sz w:val="21"/>
+          <w:szCs w:val="21"/>
+        </w:rPr>
+        <w:t xml:space="preserve">Most consequentially: once observation windows are equalised, the three launches are almost indistinguishable in unit economics, despite differing sevenfold in size. Flavour choice did not drive launch outcomes. Reach did.</w:t>
       </w:r>
     </w:p>
     <w:p>
@@ -3091,19 +3103,19 @@
     </w:p>
     <w:p>
       <w:pPr>
-        <w:pStyle w:val="Heading1"/>
-        <w:spacing w:after="160" w:before="360"/>
+        <w:pStyle w:val="Heading2"/>
+        <w:spacing w:after="120" w:before="280"/>
       </w:pPr>
       <w:r>
         <w:rPr>
           <w:rFonts w:ascii="Georgia" w:cs="Georgia" w:eastAsia="Georgia" w:hAnsi="Georgia"/>
           <w:b/>
           <w:bCs/>
-          <w:color w:val="1F4E45"/>
-          <w:sz w:val="30"/>
-          <w:szCs w:val="30"/>
-        </w:rPr>
-        <w:t xml:space="preserve">4.  Verdict</w:t>
+          <w:color w:val="1B2A27"/>
+          <w:sz w:val="25"/>
+          <w:szCs w:val="25"/>
+        </w:rPr>
+        <w:t xml:space="preserve">Result</w:t>
       </w:r>
     </w:p>
     <w:p>
@@ -3864,7 +3876,1037 @@
           <w:sz w:val="30"/>
           <w:szCs w:val="30"/>
         </w:rPr>
-        <w:t xml:space="preserve">5.  What this means</w:t>
+        <w:t xml:space="preserve">4.  Do launches pay back?</w:t>
+      </w:r>
+    </w:p>
+    <w:p>
+      <w:pPr>
+        <w:spacing w:after="160" w:line="276"/>
+      </w:pPr>
+      <w:r>
+        <w:rPr>
+          <w:rFonts w:ascii="Calibri" w:cs="Calibri" w:eastAsia="Calibri" w:hAnsi="Calibri"/>
+          <w:color w:val="1B2A27"/>
+          <w:sz w:val="21"/>
+          <w:szCs w:val="21"/>
+        </w:rPr>
+        <w:t xml:space="preserve">Proving a launch is incremental does not establish that it was worth doing. To test that, each launch is measured on what the customers it acquired went on to spend — on anything, not only the launch flavour — against the cost of acquiring a customer in that same month, taken from TrueSeaMoss's own monthly KPI view.</w:t>
+      </w:r>
+    </w:p>
+    <w:p>
+      <w:pPr>
+        <w:spacing w:after="160" w:line="276"/>
+      </w:pPr>
+      <w:r>
+        <w:rPr>
+          <w:rFonts w:ascii="Calibri" w:cs="Calibri" w:eastAsia="Calibri" w:hAnsi="Calibri"/>
+          <w:color w:val="1B2A27"/>
+          <w:sz w:val="21"/>
+          <w:szCs w:val="21"/>
+        </w:rPr>
+        <w:t xml:space="preserve">Windows must be equalised for this comparison to mean anything. Raspberry/Watermelon is recent enough that its later-acquired customers have only weeks of history, which drags its averages down for reasons that have nothing to do with the launch. Every launch below is therefore measured identically: customers acquired in the first 28 days, each observed for 60 days.</w:t>
+      </w:r>
+    </w:p>
+    <w:tbl>
+      <w:tblPr>
+        <w:tblW w:type="dxa" w:w="9360"/>
+        <w:tblBorders>
+          <w:top w:val="single" w:color="C9D4D1" w:sz="2"/>
+          <w:left w:val="none"/>
+          <w:bottom w:val="single" w:color="C9D4D1" w:sz="2"/>
+          <w:right w:val="none"/>
+          <w:insideH w:val="single" w:color="C9D4D1" w:sz="2"/>
+          <w:insideV w:val="none"/>
+        </w:tblBorders>
+      </w:tblPr>
+      <w:tblGrid>
+        <w:gridCol w:w="2160"/>
+        <w:gridCol w:w="1200"/>
+        <w:gridCol w:w="1240"/>
+        <w:gridCol w:w="1240"/>
+        <w:gridCol w:w="1000"/>
+        <w:gridCol w:w="1280"/>
+        <w:gridCol w:w="1240"/>
+      </w:tblGrid>
+      <w:tr>
+        <w:trPr>
+          <w:tblHeader/>
+        </w:trPr>
+        <w:tc>
+          <w:tcPr>
+            <w:tcW w:type="dxa" w:w="2160"/>
+            <w:shd w:fill="1F4E45" w:color="auto" w:val="clear"/>
+            <w:tcMar>
+              <w:top w:type="dxa" w:w="90"/>
+              <w:left w:type="dxa" w:w="120"/>
+              <w:bottom w:type="dxa" w:w="90"/>
+              <w:right w:type="dxa" w:w="120"/>
+            </w:tcMar>
+          </w:tcPr>
+          <w:p>
+            <w:pPr>
+              <w:spacing w:after="0"/>
+              <w:jc w:val="left"/>
+            </w:pPr>
+            <w:r>
+              <w:rPr>
+                <w:rFonts w:ascii="Calibri" w:cs="Calibri" w:eastAsia="Calibri" w:hAnsi="Calibri"/>
+                <w:b/>
+                <w:bCs/>
+                <w:color w:val="FFFFFF"/>
+                <w:sz w:val="19"/>
+                <w:szCs w:val="19"/>
+              </w:rPr>
+              <w:t xml:space="preserve">Launch</w:t>
+            </w:r>
+          </w:p>
+        </w:tc>
+        <w:tc>
+          <w:tcPr>
+            <w:tcW w:type="dxa" w:w="1200"/>
+            <w:shd w:fill="1F4E45" w:color="auto" w:val="clear"/>
+            <w:tcMar>
+              <w:top w:type="dxa" w:w="90"/>
+              <w:left w:type="dxa" w:w="120"/>
+              <w:bottom w:type="dxa" w:w="90"/>
+              <w:right w:type="dxa" w:w="120"/>
+            </w:tcMar>
+          </w:tcPr>
+          <w:p>
+            <w:pPr>
+              <w:spacing w:after="0"/>
+              <w:jc w:val="right"/>
+            </w:pPr>
+            <w:r>
+              <w:rPr>
+                <w:rFonts w:ascii="Calibri" w:cs="Calibri" w:eastAsia="Calibri" w:hAnsi="Calibri"/>
+                <w:b/>
+                <w:bCs/>
+                <w:color w:val="FFFFFF"/>
+                <w:sz w:val="19"/>
+                <w:szCs w:val="19"/>
+              </w:rPr>
+              <w:t xml:space="preserve">Acquired</w:t>
+            </w:r>
+          </w:p>
+        </w:tc>
+        <w:tc>
+          <w:tcPr>
+            <w:tcW w:type="dxa" w:w="1240"/>
+            <w:shd w:fill="1F4E45" w:color="auto" w:val="clear"/>
+            <w:tcMar>
+              <w:top w:type="dxa" w:w="90"/>
+              <w:left w:type="dxa" w:w="120"/>
+              <w:bottom w:type="dxa" w:w="90"/>
+              <w:right w:type="dxa" w:w="120"/>
+            </w:tcMar>
+          </w:tcPr>
+          <w:p>
+            <w:pPr>
+              <w:spacing w:after="0"/>
+              <w:jc w:val="right"/>
+            </w:pPr>
+            <w:r>
+              <w:rPr>
+                <w:rFonts w:ascii="Calibri" w:cs="Calibri" w:eastAsia="Calibri" w:hAnsi="Calibri"/>
+                <w:b/>
+                <w:bCs/>
+                <w:color w:val="FFFFFF"/>
+                <w:sz w:val="19"/>
+                <w:szCs w:val="19"/>
+              </w:rPr>
+              <w:t xml:space="preserve">Rev / cust</w:t>
+            </w:r>
+          </w:p>
+        </w:tc>
+        <w:tc>
+          <w:tcPr>
+            <w:tcW w:type="dxa" w:w="1240"/>
+            <w:shd w:fill="1F4E45" w:color="auto" w:val="clear"/>
+            <w:tcMar>
+              <w:top w:type="dxa" w:w="90"/>
+              <w:left w:type="dxa" w:w="120"/>
+              <w:bottom w:type="dxa" w:w="90"/>
+              <w:right w:type="dxa" w:w="120"/>
+            </w:tcMar>
+          </w:tcPr>
+          <w:p>
+            <w:pPr>
+              <w:spacing w:after="0"/>
+              <w:jc w:val="right"/>
+            </w:pPr>
+            <w:r>
+              <w:rPr>
+                <w:rFonts w:ascii="Calibri" w:cs="Calibri" w:eastAsia="Calibri" w:hAnsi="Calibri"/>
+                <w:b/>
+                <w:bCs/>
+                <w:color w:val="FFFFFF"/>
+                <w:sz w:val="19"/>
+                <w:szCs w:val="19"/>
+              </w:rPr>
+              <w:t xml:space="preserve">2nd order</w:t>
+            </w:r>
+          </w:p>
+        </w:tc>
+        <w:tc>
+          <w:tcPr>
+            <w:tcW w:type="dxa" w:w="1000"/>
+            <w:shd w:fill="1F4E45" w:color="auto" w:val="clear"/>
+            <w:tcMar>
+              <w:top w:type="dxa" w:w="90"/>
+              <w:left w:type="dxa" w:w="120"/>
+              <w:bottom w:type="dxa" w:w="90"/>
+              <w:right w:type="dxa" w:w="120"/>
+            </w:tcMar>
+          </w:tcPr>
+          <w:p>
+            <w:pPr>
+              <w:spacing w:after="0"/>
+              <w:jc w:val="right"/>
+            </w:pPr>
+            <w:r>
+              <w:rPr>
+                <w:rFonts w:ascii="Calibri" w:cs="Calibri" w:eastAsia="Calibri" w:hAnsi="Calibri"/>
+                <w:b/>
+                <w:bCs/>
+                <w:color w:val="FFFFFF"/>
+                <w:sz w:val="19"/>
+                <w:szCs w:val="19"/>
+              </w:rPr>
+              <w:t xml:space="preserve">Blended CAC</w:t>
+            </w:r>
+          </w:p>
+        </w:tc>
+        <w:tc>
+          <w:tcPr>
+            <w:tcW w:type="dxa" w:w="1280"/>
+            <w:shd w:fill="1F4E45" w:color="auto" w:val="clear"/>
+            <w:tcMar>
+              <w:top w:type="dxa" w:w="90"/>
+              <w:left w:type="dxa" w:w="120"/>
+              <w:bottom w:type="dxa" w:w="90"/>
+              <w:right w:type="dxa" w:w="120"/>
+            </w:tcMar>
+          </w:tcPr>
+          <w:p>
+            <w:pPr>
+              <w:spacing w:after="0"/>
+              <w:jc w:val="right"/>
+            </w:pPr>
+            <w:r>
+              <w:rPr>
+                <w:rFonts w:ascii="Calibri" w:cs="Calibri" w:eastAsia="Calibri" w:hAnsi="Calibri"/>
+                <w:b/>
+                <w:bCs/>
+                <w:color w:val="FFFFFF"/>
+                <w:sz w:val="19"/>
+                <w:szCs w:val="19"/>
+              </w:rPr>
+              <w:t xml:space="preserve">× CAC</w:t>
+            </w:r>
+          </w:p>
+        </w:tc>
+        <w:tc>
+          <w:tcPr>
+            <w:tcW w:type="dxa" w:w="1240"/>
+            <w:shd w:fill="1F4E45" w:color="auto" w:val="clear"/>
+            <w:tcMar>
+              <w:top w:type="dxa" w:w="90"/>
+              <w:left w:type="dxa" w:w="120"/>
+              <w:bottom w:type="dxa" w:w="90"/>
+              <w:right w:type="dxa" w:w="120"/>
+            </w:tcMar>
+          </w:tcPr>
+          <w:p>
+            <w:pPr>
+              <w:spacing w:after="0"/>
+              <w:jc w:val="right"/>
+            </w:pPr>
+            <w:r>
+              <w:rPr>
+                <w:rFonts w:ascii="Calibri" w:cs="Calibri" w:eastAsia="Calibri" w:hAnsi="Calibri"/>
+                <w:b/>
+                <w:bCs/>
+                <w:color w:val="FFFFFF"/>
+                <w:sz w:val="19"/>
+                <w:szCs w:val="19"/>
+              </w:rPr>
+              <w:t xml:space="preserve">× NCPA</w:t>
+            </w:r>
+          </w:p>
+        </w:tc>
+      </w:tr>
+      <w:tr>
+        <w:tc>
+          <w:tcPr>
+            <w:tcW w:type="dxa" w:w="2160"/>
+            <w:tcMar>
+              <w:top w:type="dxa" w:w="90"/>
+              <w:left w:type="dxa" w:w="120"/>
+              <w:bottom w:type="dxa" w:w="90"/>
+              <w:right w:type="dxa" w:w="120"/>
+            </w:tcMar>
+          </w:tcPr>
+          <w:p>
+            <w:pPr>
+              <w:spacing w:after="0"/>
+              <w:jc w:val="left"/>
+            </w:pPr>
+            <w:r>
+              <w:rPr>
+                <w:rFonts w:ascii="Calibri" w:cs="Calibri" w:eastAsia="Calibri" w:hAnsi="Calibri"/>
+                <w:b/>
+                <w:bCs/>
+                <w:color w:val="1B2A27"/>
+                <w:sz w:val="19"/>
+                <w:szCs w:val="19"/>
+              </w:rPr>
+              <w:t xml:space="preserve">Cranberry</w:t>
+            </w:r>
+          </w:p>
+        </w:tc>
+        <w:tc>
+          <w:tcPr>
+            <w:tcW w:type="dxa" w:w="1200"/>
+            <w:tcMar>
+              <w:top w:type="dxa" w:w="90"/>
+              <w:left w:type="dxa" w:w="120"/>
+              <w:bottom w:type="dxa" w:w="90"/>
+              <w:right w:type="dxa" w:w="120"/>
+            </w:tcMar>
+          </w:tcPr>
+          <w:p>
+            <w:pPr>
+              <w:spacing w:after="0"/>
+              <w:jc w:val="right"/>
+            </w:pPr>
+            <w:r>
+              <w:rPr>
+                <w:rFonts w:ascii="Calibri" w:cs="Calibri" w:eastAsia="Calibri" w:hAnsi="Calibri"/>
+                <w:b w:val="false"/>
+                <w:bCs w:val="false"/>
+                <w:color w:val="1B2A27"/>
+                <w:sz w:val="19"/>
+                <w:szCs w:val="19"/>
+              </w:rPr>
+              <w:t xml:space="preserve">1,187</w:t>
+            </w:r>
+          </w:p>
+        </w:tc>
+        <w:tc>
+          <w:tcPr>
+            <w:tcW w:type="dxa" w:w="1240"/>
+            <w:tcMar>
+              <w:top w:type="dxa" w:w="90"/>
+              <w:left w:type="dxa" w:w="120"/>
+              <w:bottom w:type="dxa" w:w="90"/>
+              <w:right w:type="dxa" w:w="120"/>
+            </w:tcMar>
+          </w:tcPr>
+          <w:p>
+            <w:pPr>
+              <w:spacing w:after="0"/>
+              <w:jc w:val="right"/>
+            </w:pPr>
+            <w:r>
+              <w:rPr>
+                <w:rFonts w:ascii="Calibri" w:cs="Calibri" w:eastAsia="Calibri" w:hAnsi="Calibri"/>
+                <w:b w:val="false"/>
+                <w:bCs w:val="false"/>
+                <w:color w:val="1B2A27"/>
+                <w:sz w:val="19"/>
+                <w:szCs w:val="19"/>
+              </w:rPr>
+              <w:t xml:space="preserve">$108.83</w:t>
+            </w:r>
+          </w:p>
+        </w:tc>
+        <w:tc>
+          <w:tcPr>
+            <w:tcW w:type="dxa" w:w="1240"/>
+            <w:tcMar>
+              <w:top w:type="dxa" w:w="90"/>
+              <w:left w:type="dxa" w:w="120"/>
+              <w:bottom w:type="dxa" w:w="90"/>
+              <w:right w:type="dxa" w:w="120"/>
+            </w:tcMar>
+          </w:tcPr>
+          <w:p>
+            <w:pPr>
+              <w:spacing w:after="0"/>
+              <w:jc w:val="right"/>
+            </w:pPr>
+            <w:r>
+              <w:rPr>
+                <w:rFonts w:ascii="Calibri" w:cs="Calibri" w:eastAsia="Calibri" w:hAnsi="Calibri"/>
+                <w:b w:val="false"/>
+                <w:bCs w:val="false"/>
+                <w:color w:val="1B2A27"/>
+                <w:sz w:val="19"/>
+                <w:szCs w:val="19"/>
+              </w:rPr>
+              <w:t xml:space="preserve">67.7%</w:t>
+            </w:r>
+          </w:p>
+        </w:tc>
+        <w:tc>
+          <w:tcPr>
+            <w:tcW w:type="dxa" w:w="1000"/>
+            <w:tcMar>
+              <w:top w:type="dxa" w:w="90"/>
+              <w:left w:type="dxa" w:w="120"/>
+              <w:bottom w:type="dxa" w:w="90"/>
+              <w:right w:type="dxa" w:w="120"/>
+            </w:tcMar>
+          </w:tcPr>
+          <w:p>
+            <w:pPr>
+              <w:spacing w:after="0"/>
+              <w:jc w:val="right"/>
+            </w:pPr>
+            <w:r>
+              <w:rPr>
+                <w:rFonts w:ascii="Calibri" w:cs="Calibri" w:eastAsia="Calibri" w:hAnsi="Calibri"/>
+                <w:b w:val="false"/>
+                <w:bCs w:val="false"/>
+                <w:color w:val="1B2A27"/>
+                <w:sz w:val="19"/>
+                <w:szCs w:val="19"/>
+              </w:rPr>
+              <w:t xml:space="preserve">$57.22</w:t>
+            </w:r>
+          </w:p>
+        </w:tc>
+        <w:tc>
+          <w:tcPr>
+            <w:tcW w:type="dxa" w:w="1280"/>
+            <w:tcMar>
+              <w:top w:type="dxa" w:w="90"/>
+              <w:left w:type="dxa" w:w="120"/>
+              <w:bottom w:type="dxa" w:w="90"/>
+              <w:right w:type="dxa" w:w="120"/>
+            </w:tcMar>
+          </w:tcPr>
+          <w:p>
+            <w:pPr>
+              <w:spacing w:after="0"/>
+              <w:jc w:val="right"/>
+            </w:pPr>
+            <w:r>
+              <w:rPr>
+                <w:rFonts w:ascii="Calibri" w:cs="Calibri" w:eastAsia="Calibri" w:hAnsi="Calibri"/>
+                <w:b w:val="false"/>
+                <w:bCs w:val="false"/>
+                <w:color w:val="1B2A27"/>
+                <w:sz w:val="19"/>
+                <w:szCs w:val="19"/>
+              </w:rPr>
+              <w:t xml:space="preserve">1.90×</w:t>
+            </w:r>
+          </w:p>
+        </w:tc>
+        <w:tc>
+          <w:tcPr>
+            <w:tcW w:type="dxa" w:w="1240"/>
+            <w:tcMar>
+              <w:top w:type="dxa" w:w="90"/>
+              <w:left w:type="dxa" w:w="120"/>
+              <w:bottom w:type="dxa" w:w="90"/>
+              <w:right w:type="dxa" w:w="120"/>
+            </w:tcMar>
+          </w:tcPr>
+          <w:p>
+            <w:pPr>
+              <w:spacing w:after="0"/>
+              <w:jc w:val="right"/>
+            </w:pPr>
+            <w:r>
+              <w:rPr>
+                <w:rFonts w:ascii="Calibri" w:cs="Calibri" w:eastAsia="Calibri" w:hAnsi="Calibri"/>
+                <w:b w:val="false"/>
+                <w:bCs w:val="false"/>
+                <w:color w:val="1B2A27"/>
+                <w:sz w:val="19"/>
+                <w:szCs w:val="19"/>
+              </w:rPr>
+              <w:t xml:space="preserve">1.24×</w:t>
+            </w:r>
+          </w:p>
+        </w:tc>
+      </w:tr>
+      <w:tr>
+        <w:tc>
+          <w:tcPr>
+            <w:tcW w:type="dxa" w:w="2160"/>
+            <w:shd w:fill="EFF3F2" w:color="auto" w:val="clear"/>
+            <w:tcMar>
+              <w:top w:type="dxa" w:w="90"/>
+              <w:left w:type="dxa" w:w="120"/>
+              <w:bottom w:type="dxa" w:w="90"/>
+              <w:right w:type="dxa" w:w="120"/>
+            </w:tcMar>
+          </w:tcPr>
+          <w:p>
+            <w:pPr>
+              <w:spacing w:after="0"/>
+              <w:jc w:val="left"/>
+            </w:pPr>
+            <w:r>
+              <w:rPr>
+                <w:rFonts w:ascii="Calibri" w:cs="Calibri" w:eastAsia="Calibri" w:hAnsi="Calibri"/>
+                <w:b/>
+                <w:bCs/>
+                <w:color w:val="1B2A27"/>
+                <w:sz w:val="19"/>
+                <w:szCs w:val="19"/>
+              </w:rPr>
+              <w:t xml:space="preserve">Peach/Pear</w:t>
+            </w:r>
+          </w:p>
+        </w:tc>
+        <w:tc>
+          <w:tcPr>
+            <w:tcW w:type="dxa" w:w="1200"/>
+            <w:shd w:fill="EFF3F2" w:color="auto" w:val="clear"/>
+            <w:tcMar>
+              <w:top w:type="dxa" w:w="90"/>
+              <w:left w:type="dxa" w:w="120"/>
+              <w:bottom w:type="dxa" w:w="90"/>
+              <w:right w:type="dxa" w:w="120"/>
+            </w:tcMar>
+          </w:tcPr>
+          <w:p>
+            <w:pPr>
+              <w:spacing w:after="0"/>
+              <w:jc w:val="right"/>
+            </w:pPr>
+            <w:r>
+              <w:rPr>
+                <w:rFonts w:ascii="Calibri" w:cs="Calibri" w:eastAsia="Calibri" w:hAnsi="Calibri"/>
+                <w:b w:val="false"/>
+                <w:bCs w:val="false"/>
+                <w:color w:val="1B2A27"/>
+                <w:sz w:val="19"/>
+                <w:szCs w:val="19"/>
+              </w:rPr>
+              <w:t xml:space="preserve">2,391</w:t>
+            </w:r>
+          </w:p>
+        </w:tc>
+        <w:tc>
+          <w:tcPr>
+            <w:tcW w:type="dxa" w:w="1240"/>
+            <w:shd w:fill="EFF3F2" w:color="auto" w:val="clear"/>
+            <w:tcMar>
+              <w:top w:type="dxa" w:w="90"/>
+              <w:left w:type="dxa" w:w="120"/>
+              <w:bottom w:type="dxa" w:w="90"/>
+              <w:right w:type="dxa" w:w="120"/>
+            </w:tcMar>
+          </w:tcPr>
+          <w:p>
+            <w:pPr>
+              <w:spacing w:after="0"/>
+              <w:jc w:val="right"/>
+            </w:pPr>
+            <w:r>
+              <w:rPr>
+                <w:rFonts w:ascii="Calibri" w:cs="Calibri" w:eastAsia="Calibri" w:hAnsi="Calibri"/>
+                <w:b w:val="false"/>
+                <w:bCs w:val="false"/>
+                <w:color w:val="1B2A27"/>
+                <w:sz w:val="19"/>
+                <w:szCs w:val="19"/>
+              </w:rPr>
+              <w:t xml:space="preserve">$104.67</w:t>
+            </w:r>
+          </w:p>
+        </w:tc>
+        <w:tc>
+          <w:tcPr>
+            <w:tcW w:type="dxa" w:w="1240"/>
+            <w:shd w:fill="EFF3F2" w:color="auto" w:val="clear"/>
+            <w:tcMar>
+              <w:top w:type="dxa" w:w="90"/>
+              <w:left w:type="dxa" w:w="120"/>
+              <w:bottom w:type="dxa" w:w="90"/>
+              <w:right w:type="dxa" w:w="120"/>
+            </w:tcMar>
+          </w:tcPr>
+          <w:p>
+            <w:pPr>
+              <w:spacing w:after="0"/>
+              <w:jc w:val="right"/>
+            </w:pPr>
+            <w:r>
+              <w:rPr>
+                <w:rFonts w:ascii="Calibri" w:cs="Calibri" w:eastAsia="Calibri" w:hAnsi="Calibri"/>
+                <w:b w:val="false"/>
+                <w:bCs w:val="false"/>
+                <w:color w:val="1B2A27"/>
+                <w:sz w:val="19"/>
+                <w:szCs w:val="19"/>
+              </w:rPr>
+              <w:t xml:space="preserve">70.7%</w:t>
+            </w:r>
+          </w:p>
+        </w:tc>
+        <w:tc>
+          <w:tcPr>
+            <w:tcW w:type="dxa" w:w="1000"/>
+            <w:shd w:fill="EFF3F2" w:color="auto" w:val="clear"/>
+            <w:tcMar>
+              <w:top w:type="dxa" w:w="90"/>
+              <w:left w:type="dxa" w:w="120"/>
+              <w:bottom w:type="dxa" w:w="90"/>
+              <w:right w:type="dxa" w:w="120"/>
+            </w:tcMar>
+          </w:tcPr>
+          <w:p>
+            <w:pPr>
+              <w:spacing w:after="0"/>
+              <w:jc w:val="right"/>
+            </w:pPr>
+            <w:r>
+              <w:rPr>
+                <w:rFonts w:ascii="Calibri" w:cs="Calibri" w:eastAsia="Calibri" w:hAnsi="Calibri"/>
+                <w:b w:val="false"/>
+                <w:bCs w:val="false"/>
+                <w:color w:val="1B2A27"/>
+                <w:sz w:val="19"/>
+                <w:szCs w:val="19"/>
+              </w:rPr>
+              <w:t xml:space="preserve">$67.66</w:t>
+            </w:r>
+          </w:p>
+        </w:tc>
+        <w:tc>
+          <w:tcPr>
+            <w:tcW w:type="dxa" w:w="1280"/>
+            <w:shd w:fill="EFF3F2" w:color="auto" w:val="clear"/>
+            <w:tcMar>
+              <w:top w:type="dxa" w:w="90"/>
+              <w:left w:type="dxa" w:w="120"/>
+              <w:bottom w:type="dxa" w:w="90"/>
+              <w:right w:type="dxa" w:w="120"/>
+            </w:tcMar>
+          </w:tcPr>
+          <w:p>
+            <w:pPr>
+              <w:spacing w:after="0"/>
+              <w:jc w:val="right"/>
+            </w:pPr>
+            <w:r>
+              <w:rPr>
+                <w:rFonts w:ascii="Calibri" w:cs="Calibri" w:eastAsia="Calibri" w:hAnsi="Calibri"/>
+                <w:b w:val="false"/>
+                <w:bCs w:val="false"/>
+                <w:color w:val="1B2A27"/>
+                <w:sz w:val="19"/>
+                <w:szCs w:val="19"/>
+              </w:rPr>
+              <w:t xml:space="preserve">1.55×</w:t>
+            </w:r>
+          </w:p>
+        </w:tc>
+        <w:tc>
+          <w:tcPr>
+            <w:tcW w:type="dxa" w:w="1240"/>
+            <w:shd w:fill="EFF3F2" w:color="auto" w:val="clear"/>
+            <w:tcMar>
+              <w:top w:type="dxa" w:w="90"/>
+              <w:left w:type="dxa" w:w="120"/>
+              <w:bottom w:type="dxa" w:w="90"/>
+              <w:right w:type="dxa" w:w="120"/>
+            </w:tcMar>
+          </w:tcPr>
+          <w:p>
+            <w:pPr>
+              <w:spacing w:after="0"/>
+              <w:jc w:val="right"/>
+            </w:pPr>
+            <w:r>
+              <w:rPr>
+                <w:rFonts w:ascii="Calibri" w:cs="Calibri" w:eastAsia="Calibri" w:hAnsi="Calibri"/>
+                <w:b w:val="false"/>
+                <w:bCs w:val="false"/>
+                <w:color w:val="1B2A27"/>
+                <w:sz w:val="19"/>
+                <w:szCs w:val="19"/>
+              </w:rPr>
+              <w:t xml:space="preserve">1.11×</w:t>
+            </w:r>
+          </w:p>
+        </w:tc>
+      </w:tr>
+      <w:tr>
+        <w:tc>
+          <w:tcPr>
+            <w:tcW w:type="dxa" w:w="2160"/>
+            <w:tcMar>
+              <w:top w:type="dxa" w:w="90"/>
+              <w:left w:type="dxa" w:w="120"/>
+              <w:bottom w:type="dxa" w:w="90"/>
+              <w:right w:type="dxa" w:w="120"/>
+            </w:tcMar>
+          </w:tcPr>
+          <w:p>
+            <w:pPr>
+              <w:spacing w:after="0"/>
+              <w:jc w:val="left"/>
+            </w:pPr>
+            <w:r>
+              <w:rPr>
+                <w:rFonts w:ascii="Calibri" w:cs="Calibri" w:eastAsia="Calibri" w:hAnsi="Calibri"/>
+                <w:b/>
+                <w:bCs/>
+                <w:color w:val="1B2A27"/>
+                <w:sz w:val="19"/>
+                <w:szCs w:val="19"/>
+              </w:rPr>
+              <w:t xml:space="preserve">Raspberry/Watermelon</w:t>
+            </w:r>
+          </w:p>
+        </w:tc>
+        <w:tc>
+          <w:tcPr>
+            <w:tcW w:type="dxa" w:w="1200"/>
+            <w:tcMar>
+              <w:top w:type="dxa" w:w="90"/>
+              <w:left w:type="dxa" w:w="120"/>
+              <w:bottom w:type="dxa" w:w="90"/>
+              <w:right w:type="dxa" w:w="120"/>
+            </w:tcMar>
+          </w:tcPr>
+          <w:p>
+            <w:pPr>
+              <w:spacing w:after="0"/>
+              <w:jc w:val="right"/>
+            </w:pPr>
+            <w:r>
+              <w:rPr>
+                <w:rFonts w:ascii="Calibri" w:cs="Calibri" w:eastAsia="Calibri" w:hAnsi="Calibri"/>
+                <w:b w:val="false"/>
+                <w:bCs w:val="false"/>
+                <w:color w:val="1B2A27"/>
+                <w:sz w:val="19"/>
+                <w:szCs w:val="19"/>
+              </w:rPr>
+              <w:t xml:space="preserve">8,586</w:t>
+            </w:r>
+          </w:p>
+        </w:tc>
+        <w:tc>
+          <w:tcPr>
+            <w:tcW w:type="dxa" w:w="1240"/>
+            <w:tcMar>
+              <w:top w:type="dxa" w:w="90"/>
+              <w:left w:type="dxa" w:w="120"/>
+              <w:bottom w:type="dxa" w:w="90"/>
+              <w:right w:type="dxa" w:w="120"/>
+            </w:tcMar>
+          </w:tcPr>
+          <w:p>
+            <w:pPr>
+              <w:spacing w:after="0"/>
+              <w:jc w:val="right"/>
+            </w:pPr>
+            <w:r>
+              <w:rPr>
+                <w:rFonts w:ascii="Calibri" w:cs="Calibri" w:eastAsia="Calibri" w:hAnsi="Calibri"/>
+                <w:b w:val="false"/>
+                <w:bCs w:val="false"/>
+                <w:color w:val="1B2A27"/>
+                <w:sz w:val="19"/>
+                <w:szCs w:val="19"/>
+              </w:rPr>
+              <w:t xml:space="preserve">$104.87</w:t>
+            </w:r>
+          </w:p>
+        </w:tc>
+        <w:tc>
+          <w:tcPr>
+            <w:tcW w:type="dxa" w:w="1240"/>
+            <w:tcMar>
+              <w:top w:type="dxa" w:w="90"/>
+              <w:left w:type="dxa" w:w="120"/>
+              <w:bottom w:type="dxa" w:w="90"/>
+              <w:right w:type="dxa" w:w="120"/>
+            </w:tcMar>
+          </w:tcPr>
+          <w:p>
+            <w:pPr>
+              <w:spacing w:after="0"/>
+              <w:jc w:val="right"/>
+            </w:pPr>
+            <w:r>
+              <w:rPr>
+                <w:rFonts w:ascii="Calibri" w:cs="Calibri" w:eastAsia="Calibri" w:hAnsi="Calibri"/>
+                <w:b w:val="false"/>
+                <w:bCs w:val="false"/>
+                <w:color w:val="1B2A27"/>
+                <w:sz w:val="19"/>
+                <w:szCs w:val="19"/>
+              </w:rPr>
+              <w:t xml:space="preserve">68.1%</w:t>
+            </w:r>
+          </w:p>
+        </w:tc>
+        <w:tc>
+          <w:tcPr>
+            <w:tcW w:type="dxa" w:w="1000"/>
+            <w:tcMar>
+              <w:top w:type="dxa" w:w="90"/>
+              <w:left w:type="dxa" w:w="120"/>
+              <w:bottom w:type="dxa" w:w="90"/>
+              <w:right w:type="dxa" w:w="120"/>
+            </w:tcMar>
+          </w:tcPr>
+          <w:p>
+            <w:pPr>
+              <w:spacing w:after="0"/>
+              <w:jc w:val="right"/>
+            </w:pPr>
+            <w:r>
+              <w:rPr>
+                <w:rFonts w:ascii="Calibri" w:cs="Calibri" w:eastAsia="Calibri" w:hAnsi="Calibri"/>
+                <w:b w:val="false"/>
+                <w:bCs w:val="false"/>
+                <w:color w:val="1B2A27"/>
+                <w:sz w:val="19"/>
+                <w:szCs w:val="19"/>
+              </w:rPr>
+              <w:t xml:space="preserve">$55.03</w:t>
+            </w:r>
+          </w:p>
+        </w:tc>
+        <w:tc>
+          <w:tcPr>
+            <w:tcW w:type="dxa" w:w="1280"/>
+            <w:tcMar>
+              <w:top w:type="dxa" w:w="90"/>
+              <w:left w:type="dxa" w:w="120"/>
+              <w:bottom w:type="dxa" w:w="90"/>
+              <w:right w:type="dxa" w:w="120"/>
+            </w:tcMar>
+          </w:tcPr>
+          <w:p>
+            <w:pPr>
+              <w:spacing w:after="0"/>
+              <w:jc w:val="right"/>
+            </w:pPr>
+            <w:r>
+              <w:rPr>
+                <w:rFonts w:ascii="Calibri" w:cs="Calibri" w:eastAsia="Calibri" w:hAnsi="Calibri"/>
+                <w:b w:val="false"/>
+                <w:bCs w:val="false"/>
+                <w:color w:val="1B2A27"/>
+                <w:sz w:val="19"/>
+                <w:szCs w:val="19"/>
+              </w:rPr>
+              <w:t xml:space="preserve">1.91×</w:t>
+            </w:r>
+          </w:p>
+        </w:tc>
+        <w:tc>
+          <w:tcPr>
+            <w:tcW w:type="dxa" w:w="1240"/>
+            <w:tcMar>
+              <w:top w:type="dxa" w:w="90"/>
+              <w:left w:type="dxa" w:w="120"/>
+              <w:bottom w:type="dxa" w:w="90"/>
+              <w:right w:type="dxa" w:w="120"/>
+            </w:tcMar>
+          </w:tcPr>
+          <w:p>
+            <w:pPr>
+              <w:spacing w:after="0"/>
+              <w:jc w:val="right"/>
+            </w:pPr>
+            <w:r>
+              <w:rPr>
+                <w:rFonts w:ascii="Calibri" w:cs="Calibri" w:eastAsia="Calibri" w:hAnsi="Calibri"/>
+                <w:b w:val="false"/>
+                <w:bCs w:val="false"/>
+                <w:color w:val="1B2A27"/>
+                <w:sz w:val="19"/>
+                <w:szCs w:val="19"/>
+              </w:rPr>
+              <w:t xml:space="preserve">1.39×</w:t>
+            </w:r>
+          </w:p>
+        </w:tc>
+      </w:tr>
+    </w:tbl>
+    <w:p>
+      <w:pPr>
+        <w:spacing w:after="260" w:before="60"/>
+      </w:pPr>
+      <w:r>
+        <w:rPr>
+          <w:rFonts w:ascii="Calibri" w:cs="Calibri" w:eastAsia="Calibri" w:hAnsi="Calibri"/>
+          <w:i/>
+          <w:iCs/>
+          <w:color w:val="5C6B68"/>
+          <w:sz w:val="17"/>
+          <w:szCs w:val="17"/>
+        </w:rPr>
+        <w:t xml:space="preserve">Blended CAC and DTC NCPA are period-matched to each launch month, from All_KPIs_Monthly_Performance (Gels, United States).</w:t>
+      </w:r>
+    </w:p>
+    <w:p>
+      <w:pPr>
+        <w:spacing w:after="160" w:line="276"/>
+      </w:pPr>
+      <w:r>
+        <w:rPr>
+          <w:rFonts w:ascii="Calibri" w:cs="Calibri" w:eastAsia="Calibri" w:hAnsi="Calibri"/>
+          <w:color w:val="1B2A27"/>
+          <w:sz w:val="21"/>
+          <w:szCs w:val="21"/>
+        </w:rPr>
+        <w:t xml:space="preserve">All three clear blended acquisition cost inside 60 days. Against DTC NCPA — the stricter measure, and arguably the right one for launches, since these are new paid customers — the margin narrows to between 1.11 and 1.39 times. These are revenue figures, not margin, so true profit payback takes longer than 60 days and cannot be settled until COGS lands with the Version 2 contribution-margin work.</w:t>
+      </w:r>
+    </w:p>
+    <w:p>
+      <w:pPr>
+        <w:pStyle w:val="Heading1"/>
+        <w:spacing w:after="160" w:before="360"/>
+      </w:pPr>
+      <w:r>
+        <w:rPr>
+          <w:rFonts w:ascii="Georgia" w:cs="Georgia" w:eastAsia="Georgia" w:hAnsi="Georgia"/>
+          <w:b/>
+          <w:bCs/>
+          <w:color w:val="1F4E45"/>
+          <w:sz w:val="30"/>
+          <w:szCs w:val="30"/>
+        </w:rPr>
+        <w:t xml:space="preserve">5.  Conclusions</w:t>
+      </w:r>
+    </w:p>
+    <w:p>
+      <w:pPr>
+        <w:pStyle w:val="Heading2"/>
+        <w:spacing w:after="120" w:before="280"/>
+      </w:pPr>
+      <w:r>
+        <w:rPr>
+          <w:rFonts w:ascii="Georgia" w:cs="Georgia" w:eastAsia="Georgia" w:hAnsi="Georgia"/>
+          <w:b/>
+          <w:bCs/>
+          <w:color w:val="1B2A27"/>
+          <w:sz w:val="25"/>
+          <w:szCs w:val="25"/>
+        </w:rPr>
+        <w:t xml:space="preserve">Launches grow the business; they do not move demand around</w:t>
+      </w:r>
+    </w:p>
+    <w:p>
+      <w:pPr>
+        <w:spacing w:after="160" w:line="276"/>
+      </w:pPr>
+      <w:r>
+        <w:rPr>
+          <w:rFonts w:ascii="Calibri" w:cs="Calibri" w:eastAsia="Calibri" w:hAnsi="Calibri"/>
+          <w:color w:val="1B2A27"/>
+          <w:sz w:val="21"/>
+          <w:szCs w:val="21"/>
+        </w:rPr>
+        <w:t xml:space="preserve">Between 80% and 93% of launch revenue comes from customers who had never bought before, and the small pre-existing slice is additive. Cannibalisation did not occur in any of the three launches and should not be treated as a gating risk in launch decisions.</w:t>
+      </w:r>
+    </w:p>
+    <w:p>
+      <w:pPr>
+        <w:pStyle w:val="Heading2"/>
+        <w:spacing w:after="120" w:before="280"/>
+      </w:pPr>
+      <w:r>
+        <w:rPr>
+          <w:rFonts w:ascii="Georgia" w:cs="Georgia" w:eastAsia="Georgia" w:hAnsi="Georgia"/>
+          <w:b/>
+          <w:bCs/>
+          <w:color w:val="1B2A27"/>
+          <w:sz w:val="25"/>
+          <w:szCs w:val="25"/>
+        </w:rPr>
+        <w:t xml:space="preserve">Flavour choice does not drive launch economics — reach does</w:t>
+      </w:r>
+    </w:p>
+    <w:p>
+      <w:pPr>
+        <w:spacing w:after="160" w:line="276"/>
+      </w:pPr>
+      <w:r>
+        <w:rPr>
+          <w:rFonts w:ascii="Calibri" w:cs="Calibri" w:eastAsia="Calibri" w:hAnsi="Calibri"/>
+          <w:color w:val="1B2A27"/>
+          <w:sz w:val="21"/>
+          <w:szCs w:val="21"/>
+        </w:rPr>
+        <w:t xml:space="preserve">This is the most actionable finding. On equalised windows the three launches are almost identical per customer: $104.67 to $108.83 in 60-day revenue, and a second-order rate between 67.7% and 70.7%. A spread of under 4% across three different flavours launched in three different quarters. Yet Raspberry/Watermelon acquired 7.2 times as many customers as Cranberry.</w:t>
+      </w:r>
+    </w:p>
+    <w:p>
+      <w:pPr>
+        <w:spacing w:after="160" w:line="276"/>
+      </w:pPr>
+      <w:r>
+        <w:rPr>
+          <w:rFonts w:ascii="Calibri" w:cs="Calibri" w:eastAsia="Calibri" w:hAnsi="Calibri"/>
+          <w:color w:val="1B2A27"/>
+          <w:sz w:val="21"/>
+          <w:szCs w:val="21"/>
+        </w:rPr>
+        <w:t xml:space="preserve">The flavour, in other words, did not determine the return. The scale of the launch did. Effort spent deliberating which flavour to launch next is better spent on how much reach the launch is given.</w:t>
+      </w:r>
+    </w:p>
+    <w:p>
+      <w:pPr>
+        <w:pStyle w:val="Heading2"/>
+        <w:spacing w:after="120" w:before="280"/>
+      </w:pPr>
+      <w:r>
+        <w:rPr>
+          <w:rFonts w:ascii="Georgia" w:cs="Georgia" w:eastAsia="Georgia" w:hAnsi="Georgia"/>
+          <w:b/>
+          <w:bCs/>
+          <w:color w:val="1B2A27"/>
+          <w:sz w:val="25"/>
+          <w:szCs w:val="25"/>
+        </w:rPr>
+        <w:t xml:space="preserve">A new flavour acts as a re-engagement trigger, not merely a product</w:t>
+      </w:r>
+    </w:p>
+    <w:p>
+      <w:pPr>
+        <w:spacing w:after="160" w:line="276"/>
+      </w:pPr>
+      <w:r>
+        <w:rPr>
+          <w:rFonts w:ascii="Calibri" w:cs="Calibri" w:eastAsia="Calibri" w:hAnsi="Calibri"/>
+          <w:color w:val="1B2A27"/>
+          <w:sz w:val="21"/>
+          <w:szCs w:val="21"/>
+        </w:rPr>
+        <w:t xml:space="preserve">In all three launches the adjusted incremental lift exceeded what adopters actually spent on the new flavour itself. Existing customers who tried it did not only add it to their basket; they raised their overall spend beyond it. A launch appears to reactivate the existing base as well as recruit a new one.</w:t>
+      </w:r>
+    </w:p>
+    <w:p>
+      <w:pPr>
+        <w:pStyle w:val="Heading2"/>
+        <w:spacing w:after="120" w:before="280"/>
+      </w:pPr>
+      <w:r>
+        <w:rPr>
+          <w:rFonts w:ascii="Georgia" w:cs="Georgia" w:eastAsia="Georgia" w:hAnsi="Georgia"/>
+          <w:b/>
+          <w:bCs/>
+          <w:color w:val="1B2A27"/>
+          <w:sz w:val="25"/>
+          <w:szCs w:val="25"/>
+        </w:rPr>
+        <w:t xml:space="preserve">Recommendation</w:t>
       </w:r>
     </w:p>
     <w:p>
@@ -3883,7 +4925,7 @@
           <w:sz w:val="21"/>
           <w:szCs w:val="21"/>
         </w:rPr>
-        <w:t xml:space="preserve">Judge launches as acquisition campaigns. The metrics that matter are new-to-brand customers, cost per acquisition and repeat rate — not share shift between flavours.</w:t>
+        <w:t xml:space="preserve">Treat flavour launches as a standing acquisition channel with predictable unit economics, not as individual portfolio bets.</w:t>
       </w:r>
     </w:p>
     <w:p>
@@ -3902,7 +4944,7 @@
           <w:sz w:val="21"/>
           <w:szCs w:val="21"/>
         </w:rPr>
-        <w:t xml:space="preserve">Cannibalisation is not the risk it is usually assumed to be. No launch took measurable share from the existing range, so portfolio-conflict concerns should not gate launch decisions.</w:t>
+        <w:t xml:space="preserve">Shift the decision from which flavour to launch toward how much media and merchandising support each launch receives, since that is the variable the data shows moving outcomes.</w:t>
       </w:r>
     </w:p>
     <w:p>
@@ -3921,7 +4963,7 @@
           <w:sz w:val="21"/>
           <w:szCs w:val="21"/>
         </w:rPr>
-        <w:t xml:space="preserve">Because repeat rates are near-identical across launches, the lever worth pulling is launch reach, not flavour selection. A bigger launch produces more customers of the same quality.</w:t>
+        <w:t xml:space="preserve">Grade future launches against Raspberry/Watermelon's curve — $260,113 at T+30 and $665,700 at T+60 — rather than against absolute revenue, which flatters older launches.</w:t>
       </w:r>
     </w:p>
     <w:p>
@@ -3940,7 +4982,7 @@
           <w:sz w:val="21"/>
           <w:szCs w:val="21"/>
         </w:rPr>
-        <w:t xml:space="preserve">Raspberry/Watermelon is the benchmark to beat. Future launches should be graded against its T+30, T+60 and T+90 curve rather than against absolute revenue.</w:t>
+        <w:t xml:space="preserve">Revisit the payback conclusion once Version 2 COGS is available. The revenue-basis result is positive, but the margin against NCPA is thin enough that the profit answer could differ.</w:t>
       </w:r>
     </w:p>
     <w:p>
@@ -4053,6 +5095,44 @@
           <w:szCs w:val="21"/>
         </w:rPr>
         <w:t xml:space="preserve">Scope is Shopify and the United States only. The August 2026 Sparkling Drink launch is excluded because it sells on TikTok and Amazon only, with no Shopify presence.</w:t>
+      </w:r>
+    </w:p>
+    <w:p>
+      <w:pPr>
+        <w:pStyle w:val="ListParagraph"/>
+        <w:numPr>
+          <w:ilvl w:val="0"/>
+          <w:numId w:val="2"/>
+        </w:numPr>
+        <w:spacing w:after="100"/>
+      </w:pPr>
+      <w:r>
+        <w:rPr>
+          <w:rFonts w:ascii="Calibri" w:cs="Calibri" w:eastAsia="Calibri" w:hAnsi="Calibri"/>
+          <w:color w:val="1B2A27"/>
+          <w:sz w:val="21"/>
+          <w:szCs w:val="21"/>
+        </w:rPr>
+        <w:t xml:space="preserve">Payback in Section 4 counts everything an acquired customer spent in their first 60 days, not only the launch flavour, since the launch is credited with the customer rather than the single product.</w:t>
+      </w:r>
+    </w:p>
+    <w:p>
+      <w:pPr>
+        <w:pStyle w:val="ListParagraph"/>
+        <w:numPr>
+          <w:ilvl w:val="0"/>
+          <w:numId w:val="2"/>
+        </w:numPr>
+        <w:spacing w:after="100"/>
+      </w:pPr>
+      <w:r>
+        <w:rPr>
+          <w:rFonts w:ascii="Calibri" w:cs="Calibri" w:eastAsia="Calibri" w:hAnsi="Calibri"/>
+          <w:color w:val="1B2A27"/>
+          <w:sz w:val="21"/>
+          <w:szCs w:val="21"/>
+        </w:rPr>
+        <w:t xml:space="preserve">Observation windows are equalised in Section 4 but not in Section 1, where T+30/60/90 are cumulative by construction. Comparing raw per-customer averages across launches of different ages without equalising understates the most recent launch substantially.</w:t>
       </w:r>
     </w:p>
     <w:p>

</xml_diff>

<commit_message>
Validate launch dates against Shopify publish dates
Shopify does record a storefront publish date (ShopifyProducts.published_at),
so the first-sale dates used throughout are now reconciled against it rather
than left as unverified proxies.

Cranberry matches exactly, Peach/Pear is one day out and Raspberry/Watermelon
four. The electrolyte range was published 19 June 2025 but did not sell until
4 July, so the head-to-head report's claim of a 4 July launch is corrected to
a 4 July first sale after a fifteen-day dark period.

Co-Authored-By: Claude Opus 5 <noreply@anthropic.com>
Claude-Session: https://claude.ai/code/session_01JK5AXzGYuWMe65NkGxqHiE
</commit_message>
<xml_diff>
--- a/analysis/TrueSeaMoss_Flavour_Launch_Analysis.docx
+++ b/analysis/TrueSeaMoss_Flavour_Launch_Analysis.docx
@@ -228,7 +228,7 @@
           <w:sz w:val="21"/>
           <w:szCs w:val="21"/>
         </w:rPr>
-        <w:t xml:space="preserve">TrueSeaMoss keeps no launch calendar, so each launch date is derived from the first observed sale of that flavour. Indexing every launch to its own day zero allows launches from different calendar months to be compared on equal footing.</w:t>
+        <w:t xml:space="preserve">TrueSeaMoss keeps no launch calendar, so each launch date is taken from the first observed sale of that flavour and then checked against the publish date Shopify records for the product. The two agree to within four days on all three launches. Indexing every launch to its own day zero allows launches from different calendar months to be compared on equal footing.</w:t>
       </w:r>
     </w:p>
     <w:tbl>
@@ -5018,7 +5018,7 @@
           <w:sz w:val="21"/>
           <w:szCs w:val="21"/>
         </w:rPr>
-        <w:t xml:space="preserve">Launch dates are first-sale proxies. They should be reconciled against Shopify product publish dates; a soft launch ahead of promotion would shift every T+30 figure.</w:t>
+        <w:t xml:space="preserve">Launch dates are measured from first observed sale and have been validated against Shopify's own published_at field. Cranberry matches exactly (published 9 December 2025). Peach/Pear was published 19 March 2026, one day before its first sale. Raspberry/Watermelon was published 11 June 2026 and recorded no sales for four days, so its listing preceded commercial launch. First-sale dates are used throughout because they mark when a flavour began trading; the largest deviation is four days and it changes no figure materially.</w:t>
       </w:r>
     </w:p>
     <w:p>

</xml_diff>